<commit_message>
Deploying to gh-pages from @ UCD-SERG/qwt@338df91bce0760a4d2482260b2b11f40a78b1e43 🚀
</commit_message>
<xml_diff>
--- a/chapters/chapter1.docx
+++ b/chapters/chapter1.docx
@@ -537,7 +537,7 @@
         <w:t xml:space="preserve"> </w:t>
       </w:r>
       <w:r>
-        <w:t xml:space="preserve">45d37e3</w:t>
+        <w:t xml:space="preserve">338df91</w:t>
       </w:r>
     </w:p>
     <w:p>
@@ -559,7 +559,7 @@
         <w:t xml:space="preserve"> </w:t>
       </w:r>
       <w:r>
-        <w:t xml:space="preserve">45d37e330e547a5ea55a8193c47fbaf8f7acefcd</w:t>
+        <w:t xml:space="preserve">338df91bce0760a4d2482260b2b11f40a78b1e43</w:t>
       </w:r>
     </w:p>
     <w:p>
@@ -581,7 +581,7 @@
         <w:t xml:space="preserve"> </w:t>
       </w:r>
       <w:r>
-        <w:t xml:space="preserve">2026-04-06 17:47:13 -0700</w:t>
+        <w:t xml:space="preserve">2026-04-06 17:54:09 -0700</w:t>
       </w:r>
     </w:p>
     <w:p>

</xml_diff>

<commit_message>
Deploying to gh-pages from @ UCD-SERG/qwt@b043a0c998e0060e677c11404c3930cdc196a355 🚀
</commit_message>
<xml_diff>
--- a/chapters/chapter1.docx
+++ b/chapters/chapter1.docx
@@ -10,32 +10,6 @@
         <w:t xml:space="preserve">Chapter 1: Introduction</w:t>
       </w:r>
     </w:p>
-    <w:sdt>
-      <w:sdtPr>
-        <w:docPartObj>
-          <w:docPartGallery w:val="Table of Contents"/>
-          <w:docPartUnique/>
-        </w:docPartObj>
-      </w:sdtPr>
-      <w:sdtContent>
-        <w:p>
-          <w:pPr>
-            <w:pStyle w:val="TOCHeading"/>
-          </w:pPr>
-          <w:r>
-            <w:t xml:space="preserve">Table of contents</w:t>
-          </w:r>
-        </w:p>
-        <w:p>
-          <w:r>
-            <w:fldChar w:fldCharType="begin" w:dirty="true"/>
-            <w:instrText xml:space="preserve">TOC \o "1-3" \h \z \u</w:instrText>
-            <w:fldChar w:fldCharType="separate"/>
-            <w:fldChar w:fldCharType="end"/>
-          </w:r>
-        </w:p>
-      </w:sdtContent>
-    </w:sdt>
     <w:bookmarkStart w:id="16" w:name="chapter-1-introduction"/>
     <w:p>
       <w:pPr>
@@ -465,6 +439,58 @@
         <w:t xml:space="preserve">file.</w:t>
       </w:r>
     </w:p>
+    <w:p>
+      <w:pPr>
+        <w:pStyle w:val="BodyText"/>
+      </w:pPr>
+      <w:r>
+        <w:t xml:space="preserve">I’m adding some new content here:</w:t>
+      </w:r>
+    </w:p>
+    <w:p>
+      <w:pPr>
+        <w:pStyle w:val="SourceCode"/>
+      </w:pPr>
+      <w:r>
+        <w:rPr>
+          <w:rStyle w:val="DecValTok"/>
+        </w:rPr>
+        <w:t xml:space="preserve">1</w:t>
+      </w:r>
+      <w:r>
+        <w:rPr>
+          <w:rStyle w:val="NormalTok"/>
+        </w:rPr>
+        <w:t xml:space="preserve"> </w:t>
+      </w:r>
+      <w:r>
+        <w:rPr>
+          <w:rStyle w:val="SpecialCharTok"/>
+        </w:rPr>
+        <w:t xml:space="preserve">+</w:t>
+      </w:r>
+      <w:r>
+        <w:rPr>
+          <w:rStyle w:val="NormalTok"/>
+        </w:rPr>
+        <w:t xml:space="preserve"> </w:t>
+      </w:r>
+      <w:r>
+        <w:rPr>
+          <w:rStyle w:val="DecValTok"/>
+        </w:rPr>
+        <w:t xml:space="preserve">1</w:t>
+      </w:r>
+      <w:r>
+        <w:br/>
+      </w:r>
+      <w:r>
+        <w:rPr>
+          <w:rStyle w:val="CommentTok"/>
+        </w:rPr>
+        <w:t xml:space="preserve">#&gt; [1] 2</w:t>
+      </w:r>
+    </w:p>
     <w:bookmarkEnd w:id="13"/>
     <w:bookmarkStart w:id="15" w:name="references"/>
     <w:p>
@@ -479,126 +505,6 @@
     <w:bookmarkEnd w:id="14"/>
     <w:bookmarkEnd w:id="15"/>
     <w:bookmarkEnd w:id="16"/>
-    <w:bookmarkStart w:id="17" w:name="document-generation-metadata"/>
-    <w:p>
-      <w:pPr>
-        <w:pStyle w:val="Heading1"/>
-      </w:pPr>
-      <w:r>
-        <w:t xml:space="preserve">Document Generation Metadata</w:t>
-      </w:r>
-    </w:p>
-    <w:p>
-      <w:pPr>
-        <w:pStyle w:val="FirstParagraph"/>
-      </w:pPr>
-      <w:r>
-        <w:t xml:space="preserve">This document was generated from the following git commit:</w:t>
-      </w:r>
-    </w:p>
-    <w:p>
-      <w:pPr>
-        <w:pStyle w:val="Compact"/>
-        <w:numPr>
-          <w:ilvl w:val="0"/>
-          <w:numId w:val="1002"/>
-        </w:numPr>
-      </w:pPr>
-      <w:r>
-        <w:rPr>
-          <w:b/>
-          <w:bCs/>
-        </w:rPr>
-        <w:t xml:space="preserve">Branch:</w:t>
-      </w:r>
-      <w:r>
-        <w:t xml:space="preserve"> </w:t>
-      </w:r>
-      <w:r>
-        <w:t xml:space="preserve">main</w:t>
-      </w:r>
-    </w:p>
-    <w:p>
-      <w:pPr>
-        <w:pStyle w:val="Compact"/>
-        <w:numPr>
-          <w:ilvl w:val="0"/>
-          <w:numId w:val="1002"/>
-        </w:numPr>
-      </w:pPr>
-      <w:r>
-        <w:rPr>
-          <w:b/>
-          <w:bCs/>
-        </w:rPr>
-        <w:t xml:space="preserve">Commit:</w:t>
-      </w:r>
-      <w:r>
-        <w:t xml:space="preserve"> </w:t>
-      </w:r>
-      <w:r>
-        <w:t xml:space="preserve">5484a92</w:t>
-      </w:r>
-    </w:p>
-    <w:p>
-      <w:pPr>
-        <w:pStyle w:val="Compact"/>
-        <w:numPr>
-          <w:ilvl w:val="0"/>
-          <w:numId w:val="1002"/>
-        </w:numPr>
-      </w:pPr>
-      <w:r>
-        <w:rPr>
-          <w:b/>
-          <w:bCs/>
-        </w:rPr>
-        <w:t xml:space="preserve">Full commit hash:</w:t>
-      </w:r>
-      <w:r>
-        <w:t xml:space="preserve"> </w:t>
-      </w:r>
-      <w:r>
-        <w:t xml:space="preserve">5484a92114e182356a941b147243bf97cde637d8</w:t>
-      </w:r>
-    </w:p>
-    <w:p>
-      <w:pPr>
-        <w:pStyle w:val="Compact"/>
-        <w:numPr>
-          <w:ilvl w:val="0"/>
-          <w:numId w:val="1002"/>
-        </w:numPr>
-      </w:pPr>
-      <w:r>
-        <w:rPr>
-          <w:b/>
-          <w:bCs/>
-        </w:rPr>
-        <w:t xml:space="preserve">Commit date:</w:t>
-      </w:r>
-      <w:r>
-        <w:t xml:space="preserve"> </w:t>
-      </w:r>
-      <w:r>
-        <w:t xml:space="preserve">2026-04-10 01:33:19 -0700</w:t>
-      </w:r>
-    </w:p>
-    <w:p>
-      <w:pPr>
-        <w:pStyle w:val="FirstParagraph"/>
-      </w:pPr>
-      <w:r>
-        <w:t xml:space="preserve">When transferring edits from this DOCX file back to the Quarto source files,</w:t>
-      </w:r>
-      <w:r>
-        <w:t xml:space="preserve"> </w:t>
-      </w:r>
-      <w:r>
-        <w:t xml:space="preserve">use this commit information to set up the PR correctly and account for any commits that have been added since this document was generated.</w:t>
-      </w:r>
-    </w:p>
-    <w:bookmarkEnd w:id="17"/>
     <w:sectPr>
       <w:footnotePr>
         <w:numRestart w:val="eachSect"/>
@@ -816,9 +722,6 @@
     <w:abstractNumId w:val="990"/>
   </w:num>
   <w:num w:numId="1001">
-    <w:abstractNumId w:val="991"/>
-  </w:num>
-  <w:num w:numId="1002">
     <w:abstractNumId w:val="991"/>
   </w:num>
 </w:numbering>

</xml_diff>

<commit_message>
Deploying to gh-pages from @ UCD-SERG/qwt@11eda925b7f79e08e50655fbcd2e0e13e1a15022 🚀
</commit_message>
<xml_diff>
--- a/chapters/chapter1.docx
+++ b/chapters/chapter1.docx
@@ -383,7 +383,7 @@
       </w:r>
     </w:p>
     <w:bookmarkEnd w:id="12"/>
-    <w:bookmarkStart w:id="13" w:name="section-1.3"/>
+    <w:bookmarkStart w:id="14" w:name="section-1.3"/>
     <w:p>
       <w:pPr>
         <w:pStyle w:val="Heading1"/>
@@ -435,6 +435,34 @@
         <w:pStyle w:val="BodyText"/>
       </w:pPr>
       <w:r>
+        <w:t xml:space="preserve">You can also add theorem-style divs:</w:t>
+      </w:r>
+    </w:p>
+    <w:bookmarkStart w:id="13" w:name="thm-sample"/>
+    <w:p>
+      <w:pPr>
+        <w:pStyle w:val="BodyText"/>
+      </w:pPr>
+      <w:r>
+        <w:rPr>
+          <w:b/>
+          <w:bCs/>
+        </w:rPr>
+        <w:t xml:space="preserve">Theorem 1</w:t>
+      </w:r>
+      <w:r>
+        <w:t xml:space="preserve"> </w:t>
+      </w:r>
+      <w:r>
+        <w:t xml:space="preserve">This is a sample theorem block with an ID.</w:t>
+      </w:r>
+    </w:p>
+    <w:bookmarkEnd w:id="13"/>
+    <w:p>
+      <w:pPr>
+        <w:pStyle w:val="BodyText"/>
+      </w:pPr>
+      <w:r>
         <w:t xml:space="preserve">I’m adding some new content here:</w:t>
       </w:r>
     </w:p>
@@ -482,8 +510,8 @@
         <w:t xml:space="preserve">#&gt; [1] 2</w:t>
       </w:r>
     </w:p>
-    <w:bookmarkEnd w:id="13"/>
-    <w:bookmarkStart w:id="15" w:name="references"/>
+    <w:bookmarkEnd w:id="14"/>
+    <w:bookmarkStart w:id="16" w:name="references"/>
     <w:p>
       <w:pPr>
         <w:pStyle w:val="Heading1"/>
@@ -492,9 +520,9 @@
         <w:t xml:space="preserve">References</w:t>
       </w:r>
     </w:p>
-    <w:bookmarkStart w:id="14" w:name="refs"/>
-    <w:bookmarkEnd w:id="14"/>
+    <w:bookmarkStart w:id="15" w:name="refs"/>
     <w:bookmarkEnd w:id="15"/>
+    <w:bookmarkEnd w:id="16"/>
     <w:sectPr>
       <w:footnotePr>
         <w:numRestart w:val="eachSect"/>

</xml_diff>

<commit_message>
Deploying to gh-pages from @ d-morrison/qwt@2ec3bc0f82995b3fcac09ea156635b24f9bbc538 🚀
</commit_message>
<xml_diff>
--- a/chapters/chapter1.docx
+++ b/chapters/chapter1.docx
@@ -8,6 +8,14 @@
       </w:pPr>
       <w:r>
         <w:t xml:space="preserve">Chapter 1: Introduction</w:t>
+      </w:r>
+    </w:p>
+    <w:p>
+      <w:pPr>
+        <w:pStyle w:val="Date"/>
+      </w:pPr>
+      <w:r>
+        <w:t xml:space="preserve">Last modified: 2026-05-04 00:19:06 (PDT)</w:t>
       </w:r>
     </w:p>
     <w:p>

</xml_diff>